<commit_message>
Cleaned deleted temp files
</commit_message>
<xml_diff>
--- a/Information Security/8.docx
+++ b/Information Security/8.docx
@@ -5721,6 +5721,9 @@
         <w:t xml:space="preserve"> </w:t>
       </w:r>
       <w:r>
+        <w:rPr>
+          <w:b/>
+        </w:rPr>
         <w:t>What is an Elliptic Curve?</w:t>
       </w:r>
       <w:r>
@@ -5736,10 +5739,7 @@
         <w:t>Answer:</w:t>
       </w:r>
       <w:r>
-        <w:t xml:space="preserve"> </w:t>
-      </w:r>
-      <w:r>
-        <w:t xml:space="preserve">An elliptic curve E is the graph of an equation of the form y 2 = x3 + ax + b </w:t>
+        <w:t xml:space="preserve"> An elliptic curve E is the graph of an equation of the form y 2 = x3 + ax + b </w:t>
       </w:r>
       <w:r>
         <w:rPr>
@@ -5748,16 +5748,12 @@
         <w:t>❑</w:t>
       </w:r>
       <w:r>
-        <w:t xml:space="preserve"> Also </w:t>
+        <w:t xml:space="preserve"> Also includes a “point at infinity”</w:t>
+      </w:r>
+      <w:r>
+        <w:br/>
       </w:r>
       <w:bookmarkStart w:id="0" w:name="_GoBack"/>
-      <w:bookmarkEnd w:id="0"/>
-      <w:r>
-        <w:t>includes a “point at infinity”</w:t>
-      </w:r>
-      <w:r>
-        <w:br/>
-      </w:r>
       <w:r>
         <w:rPr>
           <w:b/>
@@ -5806,6 +5802,7 @@
           </wp:inline>
         </w:drawing>
       </w:r>
+      <w:bookmarkEnd w:id="0"/>
     </w:p>
     <w:p>
       <w:pPr>
@@ -5945,25 +5942,7 @@
         <w:rPr>
           <w:rStyle w:val="math-inline"/>
         </w:rPr>
-        <w:t xml:space="preserve"> </w:t>
-      </w:r>
-      <w:r>
-        <w:rPr>
-          <w:rStyle w:val="math-inline"/>
-        </w:rPr>
-        <w:t>(</w:t>
-      </w:r>
-      <w:r>
-        <w:rPr>
-          <w:rStyle w:val="math-inline"/>
-        </w:rPr>
-        <w:t>mod p</w:t>
-      </w:r>
-      <w:r>
-        <w:rPr>
-          <w:rStyle w:val="math-inline"/>
-        </w:rPr>
-        <w:t>)</w:t>
+        <w:t xml:space="preserve"> (mod p)</w:t>
       </w:r>
       <w:r>
         <w:t xml:space="preserve">, it is computationally hard to find the exponent </w:t>
@@ -7907,7 +7886,7 @@
 </file>
 
 <file path=customXml/itemProps1.xml><?xml version="1.0" encoding="utf-8"?>
-<ds:datastoreItem xmlns:ds="http://schemas.openxmlformats.org/officeDocument/2006/customXml" ds:itemID="{B9C2C804-8C8A-4859-BDCF-FD90A55C52C4}">
+<ds:datastoreItem xmlns:ds="http://schemas.openxmlformats.org/officeDocument/2006/customXml" ds:itemID="{439178BA-66DC-44DF-8C3D-D33DAD970658}">
   <ds:schemaRefs>
     <ds:schemaRef ds:uri="http://schemas.openxmlformats.org/officeDocument/2006/bibliography"/>
   </ds:schemaRefs>

</xml_diff>